<commit_message>
Update Vitals mobile roadmap with Weight v6 deployment
</commit_message>
<xml_diff>
--- a/Documents/Vitals_Mobile_Roadmap_Sep2026.docx
+++ b/Documents/Vitals_Mobile_Roadmap_Sep2026.docx
@@ -328,7 +328,7 @@
           <w:sz w:val="18"/>
           <w:szCs w:val="18"/>
         </w:rPr>
-        <w:t xml:space="preserve">Confidential — June 2026</w:t>
+        <w:t>Confidential — Updated October 1, 2026</w:t>
       </w:r>
     </w:p>
     <w:p>
@@ -1204,7 +1204,7 @@
                 <w:sz w:val="18"/>
                 <w:szCs w:val="18"/>
               </w:rPr>
-              <w:t xml:space="preserve">LOESS + regression + derivatives</w:t>
+              <w:t>Shared analytics + Weight v6</w:t>
             </w:r>
           </w:p>
         </w:tc>
@@ -3372,6 +3372,37 @@
     </w:p>
     <w:p>
       <w:pPr>
+        <w:pStyle w:val="ListParagraph"/>
+        <w:numPr>
+          <w:ilvl w:val="0"/>
+          <w:numId w:val="2"/>
+        </w:numPr>
+        <w:spacing w:after="40" w:before="40"/>
+      </w:pPr>
+      <w:r>
+        <w:rPr>
+          <w:rFonts w:ascii="Arial" w:cs="Arial" w:eastAsia="Arial" w:hAnsi="Arial"/>
+          <w:b w:val="false"/>
+          <w:bCs w:val="false"/>
+          <w:sz w:val="20"/>
+          <w:szCs w:val="20"/>
+        </w:rPr>
+        <w:t xml:space="preserve">Vitals Analysis parity in PDF: metric-specific analysis sections use the same backend contracts as the mobile Analysis view; Weight v6 includes current BMI, dated-height provenance, historical BMI, sparse-snapshot handling, trend/variation/data-support output — </w:t>
+      </w:r>
+      <w:r>
+        <w:rPr>
+          <w:rFonts w:ascii="Arial" w:cs="Arial" w:eastAsia="Arial" w:hAnsi="Arial"/>
+          <w:b/>
+          <w:bCs/>
+          <w:color w:val="2E7D32"/>
+          <w:sz w:val="20"/>
+          <w:szCs w:val="20"/>
+        </w:rPr>
+        <w:t>✅ Deployed Oct 1, 2026</w:t>
+      </w:r>
+    </w:p>
+    <w:p>
+      <w:pPr>
         <w:spacing w:after="100" w:before="0"/>
       </w:pPr>
       <w:r>
@@ -4140,20 +4171,7 @@
           <w:sz w:val="20"/>
           <w:szCs w:val="20"/>
         </w:rPr>
-        <w:t xml:space="preserve">All four mathematical layers apply identically to every tracked metric: BP, heart rate, SpO2, temperature, glucose, weight, cognitive state. The engine is built once and scales across all vital signs.</w:t>
-      </w:r>
-    </w:p>
-    <w:p>
-      <w:pPr>
-        <w:spacing w:after="60" w:before="60"/>
-      </w:pPr>
-      <w:r>
-        <w:rPr>
-          <w:rFonts w:ascii="Arial" w:cs="Arial" w:eastAsia="Arial" w:hAnsi="Arial"/>
-          <w:sz w:val="20"/>
-          <w:szCs w:val="20"/>
-        </w:rPr>
-        <w:t xml:space="preserve">Update (September 2026): in practice, Layer 4 (burden/AUC integration) does not extend unchanged to every vital as originally assumed here. BP’s burden calculation depends on a near-continuous-coverage assumption between readings, which the spec’s own AUC/Rosendaal interpolation methodology requires. Heart Rate and SpO2 are typically logged as sparse, patient-initiated spot readings rather than continuous monitoring, and applying Layer 4’s duration-weighted framing to them would overstate clinical confidence the data doesn’t support. Both vitals instead use discrete reading-count analyses (e.g., “X of Y logged readings were below threshold”) in place of duration-weighted burden, with this distinction stated explicitly in-product. See the extension section at the end of this phase.</w:t>
+        <w:t>Shared statistical and visualization infrastructure scales across tracked vitals, but the production architecture is metric-specific. Each vital defines its own context, data-support gates, algorithms, and interpretation guardrails. Weight v6 is the first completed example of that strategy: daily-median Weight summaries, robust Theil-Sen trend, current adult BMI, historical BMI, and dated-height provenance are used instead of blindly applying every blood-pressure method to Weight.</w:t>
       </w:r>
     </w:p>
     <w:p>
@@ -4293,7 +4311,7 @@
           <w:sz w:val="22"/>
           <w:szCs w:val="22"/>
         </w:rPr>
-        <w:t xml:space="preserve">Extension to Heart Rate, SpO2, and Temperature (September 2026)</w:t>
+        <w:t>Engineering Notebook Update — Weight Analysis v6 Deployment</w:t>
       </w:r>
     </w:p>
     <w:p>
@@ -4306,100 +4324,507 @@
           <w:sz w:val="20"/>
           <w:szCs w:val="20"/>
         </w:rPr>
-        <w:t xml:space="preserve">Following Phase 4's original completion, the clinical visualization engine was extended to Heart Rate, SpO2, and Temperature through dedicated engineering specifications, not a direct reuse of BP's four-layer model — each vital's own measurement characteristics call for different methodological choices in places. Heart Rate and SpO2 are sparse, patient-initiated spot readings rather than more frequent cuff-based BP data (see the Applicability update above for why Layer 4 specifically does not carry over unchanged for them). Temperature departs further still: it's modeled as an episode-centric, measurement-site-aware vital rather than a continuously-tracked one, since sparse manual readings are clinically meaningful in fever episodes, not as an ongoing trend the way BP/HR/SpO2 are.</w:t>
-      </w:r>
-    </w:p>
-    <w:p>
-      <w:pPr>
-        <w:pStyle w:val="ListParagraph"/>
-        <w:numPr>
-          <w:ilvl w:val="0"/>
-          <w:numId w:val="2"/>
-        </w:numPr>
-        <w:spacing w:after="40" w:before="40"/>
-      </w:pPr>
-      <w:r>
-        <w:rPr>
-          <w:rFonts w:ascii="Arial" w:cs="Arial" w:eastAsia="Arial" w:hAnsi="Arial"/>
-          <w:b w:val="false"/>
-          <w:bCs w:val="false"/>
-          <w:sz w:val="20"/>
-          <w:szCs w:val="20"/>
-        </w:rPr>
-        <w:t xml:space="preserve">Heart Rate — 12 of 12 P0 analysis sections implemented: resting central tendency and range, reading-to-reading dispersion with a rolling prior-30-day comparison, OLS trend with LOESS smoothing, personal baseline deviation, high/low resting-rate event counts (episode-clustered, not duration-weighted), time-of-day pattern analysis, symptom association (engine complete; awaiting a symptom-tagging UI to populate real data), cross-vital same-event context, medication-change association, and a data-support/confidence summary.</w:t>
-      </w:r>
-    </w:p>
-    <w:p>
-      <w:pPr>
-        <w:pStyle w:val="ListParagraph"/>
-        <w:numPr>
-          <w:ilvl w:val="0"/>
-          <w:numId w:val="2"/>
-        </w:numPr>
-        <w:spacing w:after="40" w:before="40"/>
-      </w:pPr>
-      <w:r>
-        <w:rPr>
-          <w:rFonts w:ascii="Arial" w:cs="Arial" w:eastAsia="Arial" w:hAnsi="Arial"/>
-          <w:b w:val="false"/>
-          <w:bCs w:val="false"/>
-          <w:sz w:val="20"/>
-          <w:szCs w:val="20"/>
-        </w:rPr>
-        <w:t xml:space="preserve">SpO2 — 13 of 13 P0 analysis sections implemented: central tendency across all logged readings (not resting-filtered — no dedicated context table exists yet for SpO2, unlike Heart Rate's), dispersion, OLS trend with LOESS smoothing, personal baseline deviation, below-target reading counts with repeat-confirmed episode detection (≥2 readings within 10 minutes of each other), reference bands framed strictly as logged-reading counts, time-of-day pattern analysis, cross-vital correlation (raw Pearson r, physician-reference only, no informal strength labeling), and a data-support/confidence summary.</w:t>
-      </w:r>
-    </w:p>
-    <w:p>
-      <w:pPr>
-        <w:pStyle w:val="ListParagraph"/>
-        <w:numPr>
-          <w:ilvl w:val="0"/>
-          <w:numId w:val="2"/>
-        </w:numPr>
-        <w:spacing w:after="40" w:before="40"/>
-      </w:pPr>
-      <w:r>
-        <w:rPr>
-          <w:rFonts w:ascii="Arial" w:cs="Arial" w:eastAsia="Arial" w:hAnsi="Arial"/>
-          <w:b w:val="false"/>
-          <w:bCs w:val="false"/>
-          <w:sz w:val="20"/>
-          <w:szCs w:val="20"/>
-        </w:rPr>
-        <w:t xml:space="preserve">Temperature — episode-centric, not central-tendency-based like the other three vitals: latest reading with measurement-site context, same-site personal baseline (excluding the active episode from its own baseline), fever-range logged-reading counts and febrile-day counts, fever episode detection (24-hour gap grouping) with peak, minimum, observed span, and change-from-peak, an acute same-site OLS trajectory within an episode, hypothermia-range safety observations, cross-vital same-event context, and a data-support/confidence summary with machine-readable reason codes alongside the free-text reason — a detail Heart Rate and SpO2's own unavailable-analysis entries don't yet carry.</w:t>
-      </w:r>
-    </w:p>
-    <w:p>
-      <w:pPr>
-        <w:pStyle w:val="ListParagraph"/>
-        <w:numPr>
-          <w:ilvl w:val="0"/>
-          <w:numId w:val="2"/>
-        </w:numPr>
-        <w:spacing w:after="40" w:before="40"/>
-      </w:pPr>
-      <w:r>
-        <w:rPr>
-          <w:rFonts w:ascii="Arial" w:cs="Arial" w:eastAsia="Arial" w:hAnsi="Arial"/>
-          <w:b w:val="false"/>
-          <w:bCs w:val="false"/>
-          <w:sz w:val="20"/>
-          <w:szCs w:val="20"/>
-        </w:rPr>
-        <w:t xml:space="preserve">All three extensions ship with: a dedicated Analysis-tab UI section (collapsible per-vital panels, consistent with the Vitals Entry screen's own redesign this cycle), a plain-English summary tailored to each vital's actual findings, a vital-specific care-team prompt, and a full clinical detail section in the exported PDF mirroring Blood Pressure's existing depth — extending physician-grade PDF output beyond BP for the first time.</w:t>
-      </w:r>
-    </w:p>
-    <w:p>
-      <w:pPr>
-        <w:spacing w:after="60" w:before="60"/>
-      </w:pPr>
-      <w:r>
-        <w:rPr>
-          <w:rFonts w:ascii="Arial" w:cs="Arial" w:eastAsia="Arial" w:hAnsi="Arial"/>
-          <w:sz w:val="20"/>
-          <w:szCs w:val="20"/>
-        </w:rPr>
-        <w:t xml:space="preserve">Not yet extended: Weight and Glucose. Specs exist for both; no dedicated engine has been built for either yet.</w:t>
+        <w:t>October 1, 2026 — The current adult Weight Analysis scope is complete and deployed end-to-end across FastAPI, the .NET MAUI Vitals Analysis view, and the clinician PDF. The implementation moved Weight from the original generic scalar/visualization concept to a dedicated v6 contract with sparse-data behavior, BMI/height provenance, and patient-scoped visibility rules.</w:t>
+      </w:r>
+    </w:p>
+    <w:p>
+      <w:pPr>
+        <w:spacing w:after="60" w:before="180"/>
+      </w:pPr>
+      <w:r>
+        <w:rPr>
+          <w:rFonts w:ascii="Arial" w:cs="Arial" w:eastAsia="Arial" w:hAnsi="Arial"/>
+          <w:b/>
+          <w:bCs/>
+          <w:color w:val="00B4C8"/>
+          <w:sz w:val="22"/>
+          <w:szCs w:val="22"/>
+        </w:rPr>
+        <w:t>Deployed Analysis Contract</w:t>
+      </w:r>
+    </w:p>
+    <w:p>
+      <w:pPr>
+        <w:pStyle w:val="ListParagraph"/>
+        <w:numPr>
+          <w:ilvl w:val="0"/>
+          <w:numId w:val="2"/>
+        </w:numPr>
+        <w:spacing w:after="40" w:before="40"/>
+      </w:pPr>
+      <w:r>
+        <w:rPr>
+          <w:rFonts w:ascii="Arial" w:cs="Arial" w:eastAsia="Arial" w:hAnsi="Arial"/>
+          <w:b w:val="false"/>
+          <w:bCs w:val="false"/>
+          <w:sz w:val="20"/>
+          <w:szCs w:val="20"/>
+        </w:rPr>
+        <w:t>Weight analysis contract version 6. Raw Weight readings are preserved; longitudinal calculations use one median Weight per local calendar day so duplicate same-day entries do not receive disproportionate statistical weight.</w:t>
+      </w:r>
+    </w:p>
+    <w:p>
+      <w:pPr>
+        <w:pStyle w:val="ListParagraph"/>
+        <w:numPr>
+          <w:ilvl w:val="0"/>
+          <w:numId w:val="2"/>
+        </w:numPr>
+        <w:spacing w:after="40" w:before="40"/>
+      </w:pPr>
+      <w:r>
+        <w:rPr>
+          <w:rFonts w:ascii="Arial" w:cs="Arial" w:eastAsia="Arial" w:hAnsi="Arial"/>
+          <w:b w:val="false"/>
+          <w:bCs w:val="false"/>
+          <w:sz w:val="20"/>
+          <w:szCs w:val="20"/>
+        </w:rPr>
+        <w:t>Current output includes latest Weight, raw and daily-median summaries, baseline change, recent 7-day comparison, daily variability (SD/IQR/MAD), robust longitudinal trend, data-support state, unavailable-analysis reason codes, and limitations.</w:t>
+      </w:r>
+    </w:p>
+    <w:p>
+      <w:pPr>
+        <w:pStyle w:val="ListParagraph"/>
+        <w:numPr>
+          <w:ilvl w:val="0"/>
+          <w:numId w:val="2"/>
+        </w:numPr>
+        <w:spacing w:after="40" w:before="40"/>
+      </w:pPr>
+      <w:r>
+        <w:rPr>
+          <w:rFonts w:ascii="Arial" w:cs="Arial" w:eastAsia="Arial" w:hAnsi="Arial"/>
+          <w:b w:val="false"/>
+          <w:bCs w:val="false"/>
+          <w:sz w:val="20"/>
+          <w:szCs w:val="20"/>
+        </w:rPr>
+        <w:t>Robust trend activates with at least 5 distinct measurement days spanning at least 14 days. Direction is based on the 95% Theil-Sen slope interval; OLS R-squared and p-value are retained only as secondary diagnostics.</w:t>
+      </w:r>
+    </w:p>
+    <w:p>
+      <w:pPr>
+        <w:pStyle w:val="ListParagraph"/>
+        <w:numPr>
+          <w:ilvl w:val="0"/>
+          <w:numId w:val="2"/>
+        </w:numPr>
+        <w:spacing w:after="40" w:before="40"/>
+      </w:pPr>
+      <w:r>
+        <w:rPr>
+          <w:rFonts w:ascii="Arial" w:cs="Arial" w:eastAsia="Arial" w:hAnsi="Arial"/>
+          <w:b w:val="false"/>
+          <w:bCs w:val="false"/>
+          <w:sz w:val="20"/>
+          <w:szCs w:val="20"/>
+        </w:rPr>
+        <w:t>Sparse Weight behavior is intentional: one reading still produces a valid snapshot and current-BMI context when eligible. If a selected report window contains no Weight but an older Weight exists, the latest known Weight is returned as an outside-window snapshot while change/variation/trend remain unavailable with explicit reasons.</w:t>
+      </w:r>
+    </w:p>
+    <w:p>
+      <w:pPr>
+        <w:pStyle w:val="ListParagraph"/>
+        <w:numPr>
+          <w:ilvl w:val="0"/>
+          <w:numId w:val="2"/>
+        </w:numPr>
+        <w:spacing w:after="40" w:before="40"/>
+      </w:pPr>
+      <w:r>
+        <w:rPr>
+          <w:rFonts w:ascii="Arial" w:cs="Arial" w:eastAsia="Arial" w:hAnsi="Arial"/>
+          <w:b w:val="false"/>
+          <w:bCs w:val="false"/>
+          <w:sz w:val="20"/>
+          <w:szCs w:val="20"/>
+        </w:rPr>
+        <w:t>Vitals Analysis and clinician PDF default to a 15-day view. Standard cached windows remain 15/30/45/60 days; custom ranges compute on demand.</w:t>
+      </w:r>
+    </w:p>
+    <w:p>
+      <w:pPr>
+        <w:spacing w:after="60" w:before="180"/>
+      </w:pPr>
+      <w:r>
+        <w:rPr>
+          <w:rFonts w:ascii="Arial" w:cs="Arial" w:eastAsia="Arial" w:hAnsi="Arial"/>
+          <w:b/>
+          <w:bCs/>
+          <w:color w:val="00B4C8"/>
+          <w:sz w:val="22"/>
+          <w:szCs w:val="22"/>
+        </w:rPr>
+        <w:t>Height History and BMI</w:t>
+      </w:r>
+    </w:p>
+    <w:p>
+      <w:pPr>
+        <w:pStyle w:val="ListParagraph"/>
+        <w:numPr>
+          <w:ilvl w:val="0"/>
+          <w:numId w:val="2"/>
+        </w:numPr>
+        <w:spacing w:after="40" w:before="40"/>
+      </w:pPr>
+      <w:r>
+        <w:rPr>
+          <w:rFonts w:ascii="Arial" w:cs="Arial" w:eastAsia="Arial" w:hAnsi="Arial"/>
+          <w:b w:val="false"/>
+          <w:bCs w:val="false"/>
+          <w:sz w:val="20"/>
+          <w:szCs w:val="20"/>
+        </w:rPr>
+        <w:t>Dated patient height history is now authoritative for BMI provenance. New height measurements and corrections preserve effective date, source, supersession, and audit history; patients.height_inches remains the current profile cache.</w:t>
+      </w:r>
+    </w:p>
+    <w:p>
+      <w:pPr>
+        <w:pStyle w:val="ListParagraph"/>
+        <w:numPr>
+          <w:ilvl w:val="0"/>
+          <w:numId w:val="2"/>
+        </w:numPr>
+        <w:spacing w:after="40" w:before="40"/>
+      </w:pPr>
+      <w:r>
+        <w:rPr>
+          <w:rFonts w:ascii="Arial" w:cs="Arial" w:eastAsia="Arial" w:hAnsi="Arial"/>
+          <w:b w:val="false"/>
+          <w:bCs w:val="false"/>
+          <w:sz w:val="20"/>
+          <w:szCs w:val="20"/>
+        </w:rPr>
+        <w:t>Current adult BMI is age-gated at age 20 or older on the latest Weight date, uses the current profile height with effective-date/source provenance, and is displayed as screening context rather than diagnosis or body-composition measurement.</w:t>
+      </w:r>
+    </w:p>
+    <w:p>
+      <w:pPr>
+        <w:pStyle w:val="ListParagraph"/>
+        <w:numPr>
+          <w:ilvl w:val="0"/>
+          <w:numId w:val="2"/>
+        </w:numPr>
+        <w:spacing w:after="40" w:before="40"/>
+      </w:pPr>
+      <w:r>
+        <w:rPr>
+          <w:rFonts w:ascii="Arial" w:cs="Arial" w:eastAsia="Arial" w:hAnsi="Arial"/>
+          <w:b w:val="false"/>
+          <w:bCs w:val="false"/>
+          <w:sz w:val="20"/>
+          <w:szCs w:val="20"/>
+        </w:rPr>
+        <w:t>Historical BMI resolves each Weight date against only the newest ACTIVE height observation whose effective_date is on or before that Weight date. Newer heights are never backfilled backward, and superseded correction rows are excluded from BMI calculations.</w:t>
+      </w:r>
+    </w:p>
+    <w:p>
+      <w:pPr>
+        <w:pStyle w:val="ListParagraph"/>
+        <w:numPr>
+          <w:ilvl w:val="0"/>
+          <w:numId w:val="2"/>
+        </w:numPr>
+        <w:spacing w:after="40" w:before="40"/>
+      </w:pPr>
+      <w:r>
+        <w:rPr>
+          <w:rFonts w:ascii="Arial" w:cs="Arial" w:eastAsia="Arial" w:hAnsi="Arial"/>
+          <w:b w:val="false"/>
+          <w:bCs w:val="false"/>
+          <w:sz w:val="20"/>
+          <w:szCs w:val="20"/>
+        </w:rPr>
+        <w:t>The migration backfill for an existing profile height is valid only from its actual migration/effective date forward. Older Weight readings therefore remain without historical BMI when no historically valid height existed.</w:t>
+      </w:r>
+    </w:p>
+    <w:p>
+      <w:pPr>
+        <w:pStyle w:val="ListParagraph"/>
+        <w:numPr>
+          <w:ilvl w:val="0"/>
+          <w:numId w:val="2"/>
+        </w:numPr>
+        <w:spacing w:after="40" w:before="40"/>
+      </w:pPr>
+      <w:r>
+        <w:rPr>
+          <w:rFonts w:ascii="Arial" w:cs="Arial" w:eastAsia="Arial" w:hAnsi="Arial"/>
+          <w:b w:val="false"/>
+          <w:bCs w:val="false"/>
+          <w:sz w:val="20"/>
+          <w:szCs w:val="20"/>
+        </w:rPr>
+        <w:t>One historically valid BMI point is presented as a single snapshot. First-to-latest BMI change is shown only when at least two historically valid points exist; PR #22 corrected the single-point copy so one point no longer looks like a trajectory.</w:t>
+      </w:r>
+    </w:p>
+    <w:p>
+      <w:pPr>
+        <w:spacing w:after="60" w:before="180"/>
+      </w:pPr>
+      <w:r>
+        <w:rPr>
+          <w:rFonts w:ascii="Arial" w:cs="Arial" w:eastAsia="Arial" w:hAnsi="Arial"/>
+          <w:b/>
+          <w:bCs/>
+          <w:color w:val="00B4C8"/>
+          <w:sz w:val="22"/>
+          <w:szCs w:val="22"/>
+        </w:rPr>
+        <w:t>Patient Preferences and PDF Source of Truth</w:t>
+      </w:r>
+    </w:p>
+    <w:p>
+      <w:pPr>
+        <w:pStyle w:val="ListParagraph"/>
+        <w:numPr>
+          <w:ilvl w:val="0"/>
+          <w:numId w:val="2"/>
+        </w:numPr>
+        <w:spacing w:after="40" w:before="40"/>
+      </w:pPr>
+      <w:r>
+        <w:rPr>
+          <w:rFonts w:ascii="Arial" w:cs="Arial" w:eastAsia="Arial" w:hAnsi="Arial"/>
+          <w:b w:val="false"/>
+          <w:bCs w:val="false"/>
+          <w:sz w:val="20"/>
+          <w:szCs w:val="20"/>
+        </w:rPr>
+        <w:t>Optional vital tracking is patient-scoped. For Weight, patients.show_weight is the persisted source of truth for visibility on the Home Dashboard, Vitals Entry, Vitals Analysis, and clinician PDF. Recorded Weight data does not force the metric visible when the preference is off.</w:t>
+      </w:r>
+    </w:p>
+    <w:p>
+      <w:pPr>
+        <w:pStyle w:val="ListParagraph"/>
+        <w:numPr>
+          <w:ilvl w:val="0"/>
+          <w:numId w:val="2"/>
+        </w:numPr>
+        <w:spacing w:after="40" w:before="40"/>
+      </w:pPr>
+      <w:r>
+        <w:rPr>
+          <w:rFonts w:ascii="Arial" w:cs="Arial" w:eastAsia="Arial" w:hAnsi="Arial"/>
+          <w:b w:val="false"/>
+          <w:bCs w:val="false"/>
+          <w:sz w:val="20"/>
+          <w:szCs w:val="20"/>
+        </w:rPr>
+        <w:t>Patient vital preferences now use dedicated patient-scoped GET/PATCH endpoints. The app caches a preference only after the server confirms persistence, and Settings serializes writes so rapid switch changes cannot race and overwrite one another.</w:t>
+      </w:r>
+    </w:p>
+    <w:p>
+      <w:pPr>
+        <w:pStyle w:val="ListParagraph"/>
+        <w:numPr>
+          <w:ilvl w:val="0"/>
+          <w:numId w:val="2"/>
+        </w:numPr>
+        <w:spacing w:after="40" w:before="40"/>
+      </w:pPr>
+      <w:r>
+        <w:rPr>
+          <w:rFonts w:ascii="Arial" w:cs="Arial" w:eastAsia="Arial" w:hAnsi="Arial"/>
+          <w:b w:val="false"/>
+          <w:bCs w:val="false"/>
+          <w:sz w:val="20"/>
+          <w:szCs w:val="20"/>
+        </w:rPr>
+        <w:t>The clinician PDF reads the selected patient's persisted server preference directly and uses the same Weight analysis contract as Vitals Analysis. Legacy user-scoped fallback and client-local PDF visibility overrides are not authoritative.</w:t>
+      </w:r>
+    </w:p>
+    <w:p>
+      <w:pPr>
+        <w:pStyle w:val="ListParagraph"/>
+        <w:numPr>
+          <w:ilvl w:val="0"/>
+          <w:numId w:val="2"/>
+        </w:numPr>
+        <w:spacing w:after="40" w:before="40"/>
+      </w:pPr>
+      <w:r>
+        <w:rPr>
+          <w:rFonts w:ascii="Arial" w:cs="Arial" w:eastAsia="Arial" w:hAnsi="Arial"/>
+          <w:b w:val="false"/>
+          <w:bCs w:val="false"/>
+          <w:sz w:val="20"/>
+          <w:szCs w:val="20"/>
+        </w:rPr>
+        <w:t>PR #18 was intentionally closed unmerged because it would have allowed recorded Weight data to override the user's Settings preference. PRs #19 and #20 established the final source-of-truth and persistence behavior.</w:t>
+      </w:r>
+    </w:p>
+    <w:p>
+      <w:pPr>
+        <w:spacing w:after="60" w:before="180"/>
+      </w:pPr>
+      <w:r>
+        <w:rPr>
+          <w:rFonts w:ascii="Arial" w:cs="Arial" w:eastAsia="Arial" w:hAnsi="Arial"/>
+          <w:b/>
+          <w:bCs/>
+          <w:color w:val="00B4C8"/>
+          <w:sz w:val="22"/>
+          <w:szCs w:val="22"/>
+        </w:rPr>
+        <w:t>Deployment and Validation</w:t>
+      </w:r>
+    </w:p>
+    <w:p>
+      <w:pPr>
+        <w:pStyle w:val="ListParagraph"/>
+        <w:numPr>
+          <w:ilvl w:val="0"/>
+          <w:numId w:val="2"/>
+        </w:numPr>
+        <w:spacing w:after="40" w:before="40"/>
+      </w:pPr>
+      <w:r>
+        <w:rPr>
+          <w:rFonts w:ascii="Arial" w:cs="Arial" w:eastAsia="Arial" w:hAnsi="Arial"/>
+          <w:b w:val="false"/>
+          <w:bCs w:val="false"/>
+          <w:sz w:val="20"/>
+          <w:szCs w:val="20"/>
+        </w:rPr>
+        <w:t>Production FastAPI on DigitalOcean was updated and the vitals-api service restarted for the Weight deployment. MAUI was rebuilt/reinstalled where client model/UI changes were required.</w:t>
+      </w:r>
+    </w:p>
+    <w:p>
+      <w:pPr>
+        <w:pStyle w:val="ListParagraph"/>
+        <w:numPr>
+          <w:ilvl w:val="0"/>
+          <w:numId w:val="2"/>
+        </w:numPr>
+        <w:spacing w:after="40" w:before="40"/>
+      </w:pPr>
+      <w:r>
+        <w:rPr>
+          <w:rFonts w:ascii="Arial" w:cs="Arial" w:eastAsia="Arial" w:hAnsi="Arial"/>
+          <w:b w:val="false"/>
+          <w:bCs w:val="false"/>
+          <w:sz w:val="20"/>
+          <w:szCs w:val="20"/>
+        </w:rPr>
+        <w:t>Preference persistence was verified directly in PostgreSQL after toggling Weight and Glucose in Settings; the patient-scoped flags now persist and remain synchronized with the GUI.</w:t>
+      </w:r>
+    </w:p>
+    <w:p>
+      <w:pPr>
+        <w:pStyle w:val="ListParagraph"/>
+        <w:numPr>
+          <w:ilvl w:val="0"/>
+          <w:numId w:val="2"/>
+        </w:numPr>
+        <w:spacing w:after="40" w:before="40"/>
+      </w:pPr>
+      <w:r>
+        <w:rPr>
+          <w:rFonts w:ascii="Arial" w:cs="Arial" w:eastAsia="Arial" w:hAnsi="Arial"/>
+          <w:b w:val="false"/>
+          <w:bCs w:val="false"/>
+          <w:sz w:val="20"/>
+          <w:szCs w:val="20"/>
+        </w:rPr>
+        <w:t>Historical-BMI no-backfill behavior was validated in both Vitals Analysis and the PDF: an older Weight with no height effective on or before that date correctly reported Historical BMI unavailable rather than borrowing a newer height.</w:t>
+      </w:r>
+    </w:p>
+    <w:p>
+      <w:pPr>
+        <w:pStyle w:val="ListParagraph"/>
+        <w:numPr>
+          <w:ilvl w:val="0"/>
+          <w:numId w:val="2"/>
+        </w:numPr>
+        <w:spacing w:after="40" w:before="40"/>
+      </w:pPr>
+      <w:r>
+        <w:rPr>
+          <w:rFonts w:ascii="Arial" w:cs="Arial" w:eastAsia="Arial" w:hAnsi="Arial"/>
+          <w:b w:val="false"/>
+          <w:bCs w:val="false"/>
+          <w:sz w:val="20"/>
+          <w:szCs w:val="20"/>
+        </w:rPr>
+        <w:t>A follow-up real-world-style reading of 239.2 lb with a 6 ft 2 in height effective October 1, 2026 produced one historically valid adult BMI point of 30.7 kg/m² in both mobile Analysis and the clinician PDF, with matching height/date provenance.</w:t>
+      </w:r>
+    </w:p>
+    <w:p>
+      <w:pPr>
+        <w:pStyle w:val="ListParagraph"/>
+        <w:numPr>
+          <w:ilvl w:val="0"/>
+          <w:numId w:val="2"/>
+        </w:numPr>
+        <w:spacing w:after="40" w:before="40"/>
+      </w:pPr>
+      <w:r>
+        <w:rPr>
+          <w:rFonts w:ascii="Arial" w:cs="Arial" w:eastAsia="Arial" w:hAnsi="Arial"/>
+          <w:b w:val="false"/>
+          <w:bCs w:val="false"/>
+          <w:sz w:val="20"/>
+          <w:szCs w:val="20"/>
+        </w:rPr>
+        <w:t>Implementation history: PR #5 established the dedicated Weight engine; PR #10 added current adult BMI; PRs #12-#16 completed the response contract, Weight UI/PDF parity, dated height history, and sparse Weight handling; PRs #19-#20 finalized patient-scoped preference source-of-truth/persistence; PRs #21-#22 delivered Historical BMI v6 and its single-point presentation correction.</w:t>
+      </w:r>
+    </w:p>
+    <w:p>
+      <w:pPr>
+        <w:spacing w:after="60" w:before="180"/>
+      </w:pPr>
+      <w:r>
+        <w:rPr>
+          <w:rFonts w:ascii="Arial" w:cs="Arial" w:eastAsia="Arial" w:hAnsi="Arial"/>
+          <w:b/>
+          <w:bCs/>
+          <w:color w:val="00B4C8"/>
+          <w:sz w:val="22"/>
+          <w:szCs w:val="22"/>
+        </w:rPr>
+        <w:t>Weight Milestone Status</w:t>
+      </w:r>
+    </w:p>
+    <w:p>
+      <w:pPr>
+        <w:pStyle w:val="ListParagraph"/>
+        <w:numPr>
+          <w:ilvl w:val="0"/>
+          <w:numId w:val="2"/>
+        </w:numPr>
+        <w:spacing w:after="40" w:before="40"/>
+      </w:pPr>
+      <w:r>
+        <w:rPr>
+          <w:rFonts w:ascii="Arial" w:cs="Arial" w:eastAsia="Arial" w:hAnsi="Arial"/>
+          <w:b w:val="false"/>
+          <w:bCs w:val="false"/>
+          <w:sz w:val="20"/>
+          <w:szCs w:val="20"/>
+        </w:rPr>
+        <w:t>Current adult Weight Analysis milestone: COMPLETE. Next metric-specific development target: Glucose Analysis.</w:t>
+      </w:r>
+    </w:p>
+    <w:p>
+      <w:pPr>
+        <w:pStyle w:val="ListParagraph"/>
+        <w:numPr>
+          <w:ilvl w:val="0"/>
+          <w:numId w:val="2"/>
+        </w:numPr>
+        <w:spacing w:after="40" w:before="40"/>
+      </w:pPr>
+      <w:r>
+        <w:rPr>
+          <w:rFonts w:ascii="Arial" w:cs="Arial" w:eastAsia="Arial" w:hAnsi="Arial"/>
+          <w:b w:val="false"/>
+          <w:bCs w:val="false"/>
+          <w:sz w:val="20"/>
+          <w:szCs w:val="20"/>
+        </w:rPr>
+        <w:t>Deferred Weight extensions are not blockers for the current adult milestone: Weight-specific LOESS charting, condition/clinician-configured rapid-change alerts, medication/cross-vital association modules, pediatric BMI-for-age/growth analysis, metric-unit entry/display expansion, and connected-scale/health-platform integrations.</w:t>
       </w:r>
     </w:p>
     <w:p>
@@ -5605,7 +6030,7 @@
           <w:sz w:val="20"/>
           <w:szCs w:val="20"/>
         </w:rPr>
-        <w:t xml:space="preserve">Vital Preferences Screen (added scope) — choose which vitals beyond blood pressure to track (heart rate, SpO₂, temperature, weight, glucose); same preference keys the real Settings screen uses, so choices made here immediately apply app-wide — </w:t>
+        <w:t xml:space="preserve">Vital Preferences Screen (added scope) — choose which vitals beyond blood pressure to track (heart rate, SpO₂, temperature, weight, glucose). Preferences are patient-scoped and persisted server-side; the Home Dashboard, Vitals Entry, Vitals Analysis, and clinician PDF use the selected patient's persisted settings — </w:t>
       </w:r>
       <w:r>
         <w:rPr>
@@ -5616,7 +6041,7 @@
           <w:sz w:val="20"/>
           <w:szCs w:val="20"/>
         </w:rPr>
-        <w:t xml:space="preserve">✅ Built</w:t>
+        <w:t>✅ Built</w:t>
       </w:r>
     </w:p>
     <w:p>
@@ -5772,6 +6197,61 @@
           <w:szCs w:val="20"/>
         </w:rPr>
         <w:t xml:space="preserve">✅ Built</w:t>
+      </w:r>
+    </w:p>
+    <w:p>
+      <w:pPr>
+        <w:spacing w:after="100" w:before="0"/>
+      </w:pPr>
+      <w:r>
+        <w:t xml:space="preserve"/>
+      </w:r>
+    </w:p>
+    <w:p>
+      <w:pPr>
+        <w:spacing w:after="60" w:before="180"/>
+      </w:pPr>
+      <w:r>
+        <w:rPr>
+          <w:rFonts w:ascii="Arial" w:cs="Arial" w:eastAsia="Arial" w:hAnsi="Arial"/>
+          <w:b/>
+          <w:bCs/>
+          <w:color w:val="00B4C8"/>
+          <w:sz w:val="22"/>
+          <w:szCs w:val="22"/>
+        </w:rPr>
+        <w:t>Resolved Issues</w:t>
+      </w:r>
+    </w:p>
+    <w:p>
+      <w:pPr>
+        <w:pStyle w:val="ListParagraph"/>
+        <w:numPr>
+          <w:ilvl w:val="0"/>
+          <w:numId w:val="2"/>
+        </w:numPr>
+        <w:spacing w:after="40" w:before="40"/>
+      </w:pPr>
+      <w:r>
+        <w:rPr>
+          <w:rFonts w:ascii="Arial" w:cs="Arial" w:eastAsia="Arial" w:hAnsi="Arial"/>
+          <w:b w:val="false"/>
+          <w:bCs w:val="false"/>
+          <w:sz w:val="20"/>
+          <w:szCs w:val="20"/>
+        </w:rPr>
+        <w:t xml:space="preserve">Vital preference display consistency (resolved Oct 1, 2026) — The current product contract now gates optional vitals consistently across the Home Dashboard, Vitals Entry, Vitals Analysis, and clinician PDF using the selected patient's persisted Settings preferences. Weight and Glucose are no longer absent when enabled, and optional metrics are not forced visible when disabled. Preference writes are patient-scoped, server-confirmed, and serialized to prevent stale local state. Vitals History is not part of the current preference-gating contract and should be handled separately if that behavior is revisited — </w:t>
+      </w:r>
+      <w:r>
+        <w:rPr>
+          <w:rFonts w:ascii="Arial" w:cs="Arial" w:eastAsia="Arial" w:hAnsi="Arial"/>
+          <w:b/>
+          <w:bCs/>
+          <w:color w:val="2E7D32"/>
+          <w:sz w:val="20"/>
+          <w:szCs w:val="20"/>
+        </w:rPr>
+        <w:t>✅ Resolved</w:t>
       </w:r>
     </w:p>
     <w:p>
@@ -7909,7 +8389,7 @@
           <w:sz w:val="26"/>
           <w:szCs w:val="26"/>
         </w:rPr>
-        <w:t xml:space="preserve">Backend Migration Trigger</w:t>
+        <w:t>Backend Migration Status</w:t>
       </w:r>
     </w:p>
     <w:p>
@@ -7922,7 +8402,7 @@
           <w:sz w:val="20"/>
           <w:szCs w:val="20"/>
         </w:rPr>
-        <w:t xml:space="preserve">The DigitalOcean migration (Phase 6) should be initiated no later than 30 days before launch. The Raspberry Pi 3B+ production backend has served development and testing reliably but is not appropriate for paying subscribers. Migration includes Nginx reverse proxy, PostgreSQL on managed storage, FastAPI deployment, SSL certificate, and DNS configuration at vitals-wellness.com.</w:t>
+        <w:t>The DigitalOcean production backend is now live and serving authenticated requests. Current deployment work is operational hardening and feature rollout rather than initial migration. The October 1, 2026 Weight Analysis v6 deployment used the production FastAPI deployment path and restarted the vitals-api service successfully; the clinician PDF and mobile Analysis view were then validated against the deployed API.</w:t>
       </w:r>
     </w:p>
     <w:p>
@@ -8022,7 +8502,7 @@
           <w:sz w:val="18"/>
           <w:szCs w:val="18"/>
         </w:rPr>
-        <w:t xml:space="preserve">Vitals — Mobile Application Development Roadmap | June 2026</w:t>
+        <w:t>Vitals — Mobile Application Development Roadmap | Updated October 2026</w:t>
       </w:r>
     </w:p>
     <w:sectPr>

</xml_diff>